<commit_message>
Documentación: se alinea con el código del 25 de octubre (lector SecuGen, roles, personal externo) y se corrige la referencia de ARQ
Co-Authored-By: Claude Sonnet 5.5 <noreply@anthropic.com>
Claude-Session: https://claude.ai/code/session_01A5yFqx2DQWq2C9ytx8Wgdf
</commit_message>
<xml_diff>
--- a/Fase 2/Evidencias del Proyecto/SICMA_ARQ_v1.0.docx
+++ b/Fase 2/Evidencias del Proyecto/SICMA_ARQ_v1.0.docx
@@ -87,7 +87,7 @@
           <w:color w:val="002840"/>
           <w:sz w:val="60"/>
         </w:rPr>
-        <w:t>Arquitectura del Sistema</w:t>
+        <w:t>SICMA · Arquitectura del Sistema</w:t>
       </w:r>
     </w:p>
     <w:p>
@@ -122,6 +122,9 @@
         <w:gridCol w:w="4365"/>
       </w:tblGrid>
       <w:tr>
+        <w:trPr>
+          <w:cantSplit/>
+        </w:trPr>
         <w:tc>
           <w:tcPr>
             <w:tcW w:type="dxa" w:w="4265"/>
@@ -791,6 +794,7 @@
       <w:tr>
         <w:trPr>
           <w:tblHeader w:val="true"/>
+          <w:cantSplit/>
         </w:trPr>
         <w:tc>
           <w:tcPr>
@@ -832,6 +836,9 @@
         </w:tc>
       </w:tr>
       <w:tr>
+        <w:trPr>
+          <w:cantSplit/>
+        </w:trPr>
         <w:tc>
           <w:tcPr>
             <w:tcW w:w="3394" w:type="dxa"/>
@@ -868,6 +875,9 @@
         </w:tc>
       </w:tr>
       <w:tr>
+        <w:trPr>
+          <w:cantSplit/>
+        </w:trPr>
         <w:tc>
           <w:tcPr>
             <w:tcW w:w="3394" w:type="dxa"/>
@@ -904,6 +914,9 @@
         </w:tc>
       </w:tr>
       <w:tr>
+        <w:trPr>
+          <w:cantSplit/>
+        </w:trPr>
         <w:tc>
           <w:tcPr>
             <w:tcW w:w="3394" w:type="dxa"/>
@@ -940,6 +953,9 @@
         </w:tc>
       </w:tr>
       <w:tr>
+        <w:trPr>
+          <w:cantSplit/>
+        </w:trPr>
         <w:tc>
           <w:tcPr>
             <w:tcW w:w="3394" w:type="dxa"/>
@@ -976,6 +992,9 @@
         </w:tc>
       </w:tr>
       <w:tr>
+        <w:trPr>
+          <w:cantSplit/>
+        </w:trPr>
         <w:tc>
           <w:tcPr>
             <w:tcW w:w="3394" w:type="dxa"/>
@@ -1006,7 +1025,7 @@
               <w:rPr>
                 <w:sz w:val="18"/>
               </w:rPr>
-              <w:t xml:space="preserve">SICMA-REQ v1.0 (requerimientos), SICMA-CUS v1.0 (casos de uso), SICMA-CLA v1.0 (clases), SICMA-ACT v1.0 (actividades), SICMA-BDD v1.0 (base de datos), SICMA-PRY v1.1 (plan) y el código del repositorio al 25 de octubre de 2026 (commit 59710a5d)</w:t>
+              <w:t>SICMA-REQ v1.1 (requerimientos), SICMA-CUS v1.1 (casos de uso), SICMA-CLA v1.1 (clases), SICMA-ACT v1.1 (actividades), SICMA-BDD v1.1 (base de datos), SICMA-PRY v1.2 (plan) y el código del repositorio al 25 de octubre de 2026 (commit 59710a5d)</w:t>
             </w:r>
           </w:p>
         </w:tc>
@@ -1037,6 +1056,7 @@
       <w:tr>
         <w:trPr>
           <w:tblHeader w:val="true"/>
+          <w:cantSplit/>
         </w:trPr>
         <w:tc>
           <w:tcPr>
@@ -1116,6 +1136,9 @@
         </w:tc>
       </w:tr>
       <w:tr>
+        <w:trPr>
+          <w:cantSplit/>
+        </w:trPr>
         <w:tc>
           <w:tcPr>
             <w:tcW w:w="972" w:type="dxa"/>
@@ -1345,6 +1368,7 @@
       <w:tr>
         <w:trPr>
           <w:tblHeader w:val="true"/>
+          <w:cantSplit/>
         </w:trPr>
         <w:tc>
           <w:tcPr>
@@ -1405,6 +1429,9 @@
         </w:tc>
       </w:tr>
       <w:tr>
+        <w:trPr>
+          <w:cantSplit/>
+        </w:trPr>
         <w:tc>
           <w:tcPr>
             <w:tcW w:w="2037" w:type="dxa"/>
@@ -1458,6 +1485,9 @@
         </w:tc>
       </w:tr>
       <w:tr>
+        <w:trPr>
+          <w:cantSplit/>
+        </w:trPr>
         <w:tc>
           <w:tcPr>
             <w:tcW w:w="2037" w:type="dxa"/>
@@ -1511,6 +1541,9 @@
         </w:tc>
       </w:tr>
       <w:tr>
+        <w:trPr>
+          <w:cantSplit/>
+        </w:trPr>
         <w:tc>
           <w:tcPr>
             <w:tcW w:w="2037" w:type="dxa"/>
@@ -1564,6 +1597,9 @@
         </w:tc>
       </w:tr>
       <w:tr>
+        <w:trPr>
+          <w:cantSplit/>
+        </w:trPr>
         <w:tc>
           <w:tcPr>
             <w:tcW w:w="2037" w:type="dxa"/>
@@ -1617,6 +1653,9 @@
         </w:tc>
       </w:tr>
       <w:tr>
+        <w:trPr>
+          <w:cantSplit/>
+        </w:trPr>
         <w:tc>
           <w:tcPr>
             <w:tcW w:w="2037" w:type="dxa"/>
@@ -1670,6 +1709,9 @@
         </w:tc>
       </w:tr>
       <w:tr>
+        <w:trPr>
+          <w:cantSplit/>
+        </w:trPr>
         <w:tc>
           <w:tcPr>
             <w:tcW w:w="2037" w:type="dxa"/>
@@ -1771,6 +1813,7 @@
       <w:tr>
         <w:trPr>
           <w:tblHeader w:val="true"/>
+          <w:cantSplit/>
         </w:trPr>
         <w:tc>
           <w:tcPr>
@@ -1850,6 +1893,9 @@
         </w:tc>
       </w:tr>
       <w:tr>
+        <w:trPr>
+          <w:cantSplit/>
+        </w:trPr>
         <w:tc>
           <w:tcPr>
             <w:tcW w:w="1655" w:type="dxa"/>
@@ -1920,6 +1966,9 @@
         </w:tc>
       </w:tr>
       <w:tr>
+        <w:trPr>
+          <w:cantSplit/>
+        </w:trPr>
         <w:tc>
           <w:tcPr>
             <w:tcW w:w="1655" w:type="dxa"/>
@@ -1990,6 +2039,9 @@
         </w:tc>
       </w:tr>
       <w:tr>
+        <w:trPr>
+          <w:cantSplit/>
+        </w:trPr>
         <w:tc>
           <w:tcPr>
             <w:tcW w:w="1655" w:type="dxa"/>
@@ -2060,6 +2112,9 @@
         </w:tc>
       </w:tr>
       <w:tr>
+        <w:trPr>
+          <w:cantSplit/>
+        </w:trPr>
         <w:tc>
           <w:tcPr>
             <w:tcW w:w="1655" w:type="dxa"/>
@@ -2130,6 +2185,9 @@
         </w:tc>
       </w:tr>
       <w:tr>
+        <w:trPr>
+          <w:cantSplit/>
+        </w:trPr>
         <w:tc>
           <w:tcPr>
             <w:tcW w:w="1655" w:type="dxa"/>
@@ -2317,6 +2375,7 @@
       <w:tr>
         <w:trPr>
           <w:tblHeader w:val="true"/>
+          <w:cantSplit/>
         </w:trPr>
         <w:tc>
           <w:tcPr>
@@ -2396,6 +2455,9 @@
         </w:tc>
       </w:tr>
       <w:tr>
+        <w:trPr>
+          <w:cantSplit/>
+        </w:trPr>
         <w:tc>
           <w:tcPr>
             <w:tcW w:w="1227" w:type="dxa"/>
@@ -2466,6 +2528,9 @@
         </w:tc>
       </w:tr>
       <w:tr>
+        <w:trPr>
+          <w:cantSplit/>
+        </w:trPr>
         <w:tc>
           <w:tcPr>
             <w:tcW w:w="1227" w:type="dxa"/>
@@ -2536,6 +2601,9 @@
         </w:tc>
       </w:tr>
       <w:tr>
+        <w:trPr>
+          <w:cantSplit/>
+        </w:trPr>
         <w:tc>
           <w:tcPr>
             <w:tcW w:w="1227" w:type="dxa"/>
@@ -2606,6 +2674,9 @@
         </w:tc>
       </w:tr>
       <w:tr>
+        <w:trPr>
+          <w:cantSplit/>
+        </w:trPr>
         <w:tc>
           <w:tcPr>
             <w:tcW w:w="1227" w:type="dxa"/>
@@ -2676,6 +2747,9 @@
         </w:tc>
       </w:tr>
       <w:tr>
+        <w:trPr>
+          <w:cantSplit/>
+        </w:trPr>
         <w:tc>
           <w:tcPr>
             <w:tcW w:w="1227" w:type="dxa"/>
@@ -2746,6 +2820,9 @@
         </w:tc>
       </w:tr>
       <w:tr>
+        <w:trPr>
+          <w:cantSplit/>
+        </w:trPr>
         <w:tc>
           <w:tcPr>
             <w:tcW w:w="1227" w:type="dxa"/>
@@ -2816,6 +2893,9 @@
         </w:tc>
       </w:tr>
       <w:tr>
+        <w:trPr>
+          <w:cantSplit/>
+        </w:trPr>
         <w:tc>
           <w:tcPr>
             <w:tcW w:w="1227" w:type="dxa"/>
@@ -2945,6 +3025,7 @@
       <w:tr>
         <w:trPr>
           <w:tblHeader w:val="true"/>
+          <w:cantSplit/>
         </w:trPr>
         <w:tc>
           <w:tcPr>
@@ -2986,6 +3067,9 @@
         </w:tc>
       </w:tr>
       <w:tr>
+        <w:trPr>
+          <w:cantSplit/>
+        </w:trPr>
         <w:tc>
           <w:tcPr>
             <w:tcW w:w="3573" w:type="dxa"/>
@@ -3022,6 +3106,9 @@
         </w:tc>
       </w:tr>
       <w:tr>
+        <w:trPr>
+          <w:cantSplit/>
+        </w:trPr>
         <w:tc>
           <w:tcPr>
             <w:tcW w:w="3573" w:type="dxa"/>
@@ -3058,6 +3145,9 @@
         </w:tc>
       </w:tr>
       <w:tr>
+        <w:trPr>
+          <w:cantSplit/>
+        </w:trPr>
         <w:tc>
           <w:tcPr>
             <w:tcW w:w="3573" w:type="dxa"/>
@@ -3094,6 +3184,9 @@
         </w:tc>
       </w:tr>
       <w:tr>
+        <w:trPr>
+          <w:cantSplit/>
+        </w:trPr>
         <w:tc>
           <w:tcPr>
             <w:tcW w:w="3573" w:type="dxa"/>
@@ -3130,6 +3223,9 @@
         </w:tc>
       </w:tr>
       <w:tr>
+        <w:trPr>
+          <w:cantSplit/>
+        </w:trPr>
         <w:tc>
           <w:tcPr>
             <w:tcW w:w="3573" w:type="dxa"/>
@@ -3166,6 +3262,9 @@
         </w:tc>
       </w:tr>
       <w:tr>
+        <w:trPr>
+          <w:cantSplit/>
+        </w:trPr>
         <w:tc>
           <w:tcPr>
             <w:tcW w:w="3573" w:type="dxa"/>
@@ -3202,6 +3301,9 @@
         </w:tc>
       </w:tr>
       <w:tr>
+        <w:trPr>
+          <w:cantSplit/>
+        </w:trPr>
         <w:tc>
           <w:tcPr>
             <w:tcW w:w="3573" w:type="dxa"/>
@@ -3355,6 +3457,7 @@
       <w:tr>
         <w:trPr>
           <w:tblHeader w:val="true"/>
+          <w:cantSplit/>
         </w:trPr>
         <w:tc>
           <w:tcPr>
@@ -3415,6 +3518,9 @@
         </w:tc>
       </w:tr>
       <w:tr>
+        <w:trPr>
+          <w:cantSplit/>
+        </w:trPr>
         <w:tc>
           <w:tcPr>
             <w:tcW w:w="2339" w:type="dxa"/>
@@ -3468,6 +3574,9 @@
         </w:tc>
       </w:tr>
       <w:tr>
+        <w:trPr>
+          <w:cantSplit/>
+        </w:trPr>
         <w:tc>
           <w:tcPr>
             <w:tcW w:w="2339" w:type="dxa"/>
@@ -3522,6 +3631,9 @@
         </w:tc>
       </w:tr>
       <w:tr>
+        <w:trPr>
+          <w:cantSplit/>
+        </w:trPr>
         <w:tc>
           <w:tcPr>
             <w:tcW w:w="2339" w:type="dxa"/>
@@ -3576,6 +3688,9 @@
         </w:tc>
       </w:tr>
       <w:tr>
+        <w:trPr>
+          <w:cantSplit/>
+        </w:trPr>
         <w:tc>
           <w:tcPr>
             <w:tcW w:w="2339" w:type="dxa"/>
@@ -3893,6 +4008,7 @@
       <w:tr>
         <w:trPr>
           <w:tblHeader w:val="true"/>
+          <w:cantSplit/>
         </w:trPr>
         <w:tc>
           <w:tcPr>
@@ -3934,6 +4050,9 @@
         </w:tc>
       </w:tr>
       <w:tr>
+        <w:trPr>
+          <w:cantSplit/>
+        </w:trPr>
         <w:tc>
           <w:tcPr>
             <w:tcW w:w="3120" w:type="dxa"/>
@@ -3995,6 +4114,9 @@
         </w:tc>
       </w:tr>
       <w:tr>
+        <w:trPr>
+          <w:cantSplit/>
+        </w:trPr>
         <w:tc>
           <w:tcPr>
             <w:tcW w:w="3120" w:type="dxa"/>
@@ -4031,6 +4153,9 @@
         </w:tc>
       </w:tr>
       <w:tr>
+        <w:trPr>
+          <w:cantSplit/>
+        </w:trPr>
         <w:tc>
           <w:tcPr>
             <w:tcW w:w="3120" w:type="dxa"/>
@@ -4067,6 +4192,9 @@
         </w:tc>
       </w:tr>
       <w:tr>
+        <w:trPr>
+          <w:cantSplit/>
+        </w:trPr>
         <w:tc>
           <w:tcPr>
             <w:tcW w:w="3120" w:type="dxa"/>
@@ -4103,6 +4231,9 @@
         </w:tc>
       </w:tr>
       <w:tr>
+        <w:trPr>
+          <w:cantSplit/>
+        </w:trPr>
         <w:tc>
           <w:tcPr>
             <w:tcW w:w="3120" w:type="dxa"/>
@@ -4172,6 +4303,7 @@
       <w:tr>
         <w:trPr>
           <w:tblHeader w:val="true"/>
+          <w:cantSplit/>
         </w:trPr>
         <w:tc>
           <w:tcPr>
@@ -4232,6 +4364,9 @@
         </w:tc>
       </w:tr>
       <w:tr>
+        <w:trPr>
+          <w:cantSplit/>
+        </w:trPr>
         <w:tc>
           <w:tcPr>
             <w:tcW w:w="2353" w:type="dxa"/>
@@ -4285,6 +4420,9 @@
         </w:tc>
       </w:tr>
       <w:tr>
+        <w:trPr>
+          <w:cantSplit/>
+        </w:trPr>
         <w:tc>
           <w:tcPr>
             <w:tcW w:w="2353" w:type="dxa"/>
@@ -4338,6 +4476,9 @@
         </w:tc>
       </w:tr>
       <w:tr>
+        <w:trPr>
+          <w:cantSplit/>
+        </w:trPr>
         <w:tc>
           <w:tcPr>
             <w:tcW w:w="2353" w:type="dxa"/>
@@ -4391,6 +4532,9 @@
         </w:tc>
       </w:tr>
       <w:tr>
+        <w:trPr>
+          <w:cantSplit/>
+        </w:trPr>
         <w:tc>
           <w:tcPr>
             <w:tcW w:w="2353" w:type="dxa"/>
@@ -4444,6 +4588,9 @@
         </w:tc>
       </w:tr>
       <w:tr>
+        <w:trPr>
+          <w:cantSplit/>
+        </w:trPr>
         <w:tc>
           <w:tcPr>
             <w:tcW w:w="2353" w:type="dxa"/>
@@ -4497,6 +4644,9 @@
         </w:tc>
       </w:tr>
       <w:tr>
+        <w:trPr>
+          <w:cantSplit/>
+        </w:trPr>
         <w:tc>
           <w:tcPr>
             <w:tcW w:w="2353" w:type="dxa"/>
@@ -4550,6 +4700,9 @@
         </w:tc>
       </w:tr>
       <w:tr>
+        <w:trPr>
+          <w:cantSplit/>
+        </w:trPr>
         <w:tc>
           <w:tcPr>
             <w:tcW w:w="2353" w:type="dxa"/>
@@ -4754,6 +4907,7 @@
       <w:tr>
         <w:trPr>
           <w:tblHeader w:val="true"/>
+          <w:cantSplit/>
         </w:trPr>
         <w:tc>
           <w:tcPr>
@@ -4814,6 +4968,9 @@
         </w:tc>
       </w:tr>
       <w:tr>
+        <w:trPr>
+          <w:cantSplit/>
+        </w:trPr>
         <w:tc>
           <w:tcPr>
             <w:tcW w:w="2198" w:type="dxa"/>
@@ -4867,6 +5024,9 @@
         </w:tc>
       </w:tr>
       <w:tr>
+        <w:trPr>
+          <w:cantSplit/>
+        </w:trPr>
         <w:tc>
           <w:tcPr>
             <w:tcW w:w="2198" w:type="dxa"/>
@@ -4920,6 +5080,9 @@
         </w:tc>
       </w:tr>
       <w:tr>
+        <w:trPr>
+          <w:cantSplit/>
+        </w:trPr>
         <w:tc>
           <w:tcPr>
             <w:tcW w:w="2198" w:type="dxa"/>
@@ -4973,6 +5136,9 @@
         </w:tc>
       </w:tr>
       <w:tr>
+        <w:trPr>
+          <w:cantSplit/>
+        </w:trPr>
         <w:tc>
           <w:tcPr>
             <w:tcW w:w="2198" w:type="dxa"/>
@@ -5026,6 +5192,9 @@
         </w:tc>
       </w:tr>
       <w:tr>
+        <w:trPr>
+          <w:cantSplit/>
+        </w:trPr>
         <w:tc>
           <w:tcPr>
             <w:tcW w:w="2198" w:type="dxa"/>
@@ -5079,6 +5248,9 @@
         </w:tc>
       </w:tr>
       <w:tr>
+        <w:trPr>
+          <w:cantSplit/>
+        </w:trPr>
         <w:tc>
           <w:tcPr>
             <w:tcW w:w="2198" w:type="dxa"/>
@@ -5132,6 +5304,9 @@
         </w:tc>
       </w:tr>
       <w:tr>
+        <w:trPr>
+          <w:cantSplit/>
+        </w:trPr>
         <w:tc>
           <w:tcPr>
             <w:tcW w:w="2198" w:type="dxa"/>
@@ -5185,6 +5360,9 @@
         </w:tc>
       </w:tr>
       <w:tr>
+        <w:trPr>
+          <w:cantSplit/>
+        </w:trPr>
         <w:tc>
           <w:tcPr>
             <w:tcW w:w="2198" w:type="dxa"/>
@@ -5295,6 +5473,7 @@
       <w:tr>
         <w:trPr>
           <w:tblHeader w:val="true"/>
+          <w:cantSplit/>
         </w:trPr>
         <w:tc>
           <w:tcPr>
@@ -5355,6 +5534,9 @@
         </w:tc>
       </w:tr>
       <w:tr>
+        <w:trPr>
+          <w:cantSplit/>
+        </w:trPr>
         <w:tc>
           <w:tcPr>
             <w:tcW w:w="3908" w:type="dxa"/>
@@ -5408,6 +5590,9 @@
         </w:tc>
       </w:tr>
       <w:tr>
+        <w:trPr>
+          <w:cantSplit/>
+        </w:trPr>
         <w:tc>
           <w:tcPr>
             <w:tcW w:w="3908" w:type="dxa"/>
@@ -5461,6 +5646,9 @@
         </w:tc>
       </w:tr>
       <w:tr>
+        <w:trPr>
+          <w:cantSplit/>
+        </w:trPr>
         <w:tc>
           <w:tcPr>
             <w:tcW w:w="3908" w:type="dxa"/>
@@ -5514,6 +5702,9 @@
         </w:tc>
       </w:tr>
       <w:tr>
+        <w:trPr>
+          <w:cantSplit/>
+        </w:trPr>
         <w:tc>
           <w:tcPr>
             <w:tcW w:w="3908" w:type="dxa"/>
@@ -5567,6 +5758,9 @@
         </w:tc>
       </w:tr>
       <w:tr>
+        <w:trPr>
+          <w:cantSplit/>
+        </w:trPr>
         <w:tc>
           <w:tcPr>
             <w:tcW w:w="3908" w:type="dxa"/>
@@ -5620,6 +5814,9 @@
         </w:tc>
       </w:tr>
       <w:tr>
+        <w:trPr>
+          <w:cantSplit/>
+        </w:trPr>
         <w:tc>
           <w:tcPr>
             <w:tcW w:w="3908" w:type="dxa"/>
@@ -5673,6 +5870,9 @@
         </w:tc>
       </w:tr>
       <w:tr>
+        <w:trPr>
+          <w:cantSplit/>
+        </w:trPr>
         <w:tc>
           <w:tcPr>
             <w:tcW w:w="3908" w:type="dxa"/>
@@ -5726,6 +5926,9 @@
         </w:tc>
       </w:tr>
       <w:tr>
+        <w:trPr>
+          <w:cantSplit/>
+        </w:trPr>
         <w:tc>
           <w:tcPr>
             <w:tcW w:w="3908" w:type="dxa"/>
@@ -5779,6 +5982,9 @@
         </w:tc>
       </w:tr>
       <w:tr>
+        <w:trPr>
+          <w:cantSplit/>
+        </w:trPr>
         <w:tc>
           <w:tcPr>
             <w:tcW w:w="3908" w:type="dxa"/>
@@ -5975,6 +6181,7 @@
       <w:tr>
         <w:trPr>
           <w:tblHeader w:val="true"/>
+          <w:cantSplit/>
         </w:trPr>
         <w:tc>
           <w:tcPr>
@@ -6016,6 +6223,9 @@
         </w:tc>
       </w:tr>
       <w:tr>
+        <w:trPr>
+          <w:cantSplit/>
+        </w:trPr>
         <w:tc>
           <w:tcPr>
             <w:tcW w:w="4510" w:type="dxa"/>
@@ -6052,6 +6262,9 @@
         </w:tc>
       </w:tr>
       <w:tr>
+        <w:trPr>
+          <w:cantSplit/>
+        </w:trPr>
         <w:tc>
           <w:tcPr>
             <w:tcW w:w="4510" w:type="dxa"/>
@@ -6088,6 +6301,9 @@
         </w:tc>
       </w:tr>
       <w:tr>
+        <w:trPr>
+          <w:cantSplit/>
+        </w:trPr>
         <w:tc>
           <w:tcPr>
             <w:tcW w:w="4510" w:type="dxa"/>
@@ -6124,6 +6340,9 @@
         </w:tc>
       </w:tr>
       <w:tr>
+        <w:trPr>
+          <w:cantSplit/>
+        </w:trPr>
         <w:tc>
           <w:tcPr>
             <w:tcW w:w="4510" w:type="dxa"/>
@@ -6160,6 +6379,9 @@
         </w:tc>
       </w:tr>
       <w:tr>
+        <w:trPr>
+          <w:cantSplit/>
+        </w:trPr>
         <w:tc>
           <w:tcPr>
             <w:tcW w:w="4510" w:type="dxa"/>
@@ -6196,6 +6418,9 @@
         </w:tc>
       </w:tr>
       <w:tr>
+        <w:trPr>
+          <w:cantSplit/>
+        </w:trPr>
         <w:tc>
           <w:tcPr>
             <w:tcW w:w="4510" w:type="dxa"/>
@@ -6232,6 +6457,9 @@
         </w:tc>
       </w:tr>
       <w:tr>
+        <w:trPr>
+          <w:cantSplit/>
+        </w:trPr>
         <w:tc>
           <w:tcPr>
             <w:tcW w:w="4510" w:type="dxa"/>
@@ -6268,6 +6496,9 @@
         </w:tc>
       </w:tr>
       <w:tr>
+        <w:trPr>
+          <w:cantSplit/>
+        </w:trPr>
         <w:tc>
           <w:tcPr>
             <w:tcW w:w="4510" w:type="dxa"/>
@@ -6337,6 +6568,7 @@
       <w:tr>
         <w:trPr>
           <w:tblHeader w:val="true"/>
+          <w:cantSplit/>
         </w:trPr>
         <w:tc>
           <w:tcPr>
@@ -6397,6 +6629,9 @@
         </w:tc>
       </w:tr>
       <w:tr>
+        <w:trPr>
+          <w:cantSplit/>
+        </w:trPr>
         <w:tc>
           <w:tcPr>
             <w:tcW w:w="3098" w:type="dxa"/>
@@ -6475,6 +6710,9 @@
         </w:tc>
       </w:tr>
       <w:tr>
+        <w:trPr>
+          <w:cantSplit/>
+        </w:trPr>
         <w:tc>
           <w:tcPr>
             <w:tcW w:w="3098" w:type="dxa"/>
@@ -6528,6 +6766,9 @@
         </w:tc>
       </w:tr>
       <w:tr>
+        <w:trPr>
+          <w:cantSplit/>
+        </w:trPr>
         <w:tc>
           <w:tcPr>
             <w:tcW w:w="3098" w:type="dxa"/>
@@ -6581,6 +6822,9 @@
         </w:tc>
       </w:tr>
       <w:tr>
+        <w:trPr>
+          <w:cantSplit/>
+        </w:trPr>
         <w:tc>
           <w:tcPr>
             <w:tcW w:w="3098" w:type="dxa"/>
@@ -6634,6 +6878,9 @@
         </w:tc>
       </w:tr>
       <w:tr>
+        <w:trPr>
+          <w:cantSplit/>
+        </w:trPr>
         <w:tc>
           <w:tcPr>
             <w:tcW w:w="3098" w:type="dxa"/>
@@ -6736,6 +6983,7 @@
       <w:tr>
         <w:trPr>
           <w:tblHeader w:val="true"/>
+          <w:cantSplit/>
         </w:trPr>
         <w:tc>
           <w:tcPr>
@@ -6815,6 +7063,9 @@
         </w:tc>
       </w:tr>
       <w:tr>
+        <w:trPr>
+          <w:cantSplit/>
+        </w:trPr>
         <w:tc>
           <w:tcPr>
             <w:tcW w:w="929" w:type="dxa"/>
@@ -6885,6 +7136,9 @@
         </w:tc>
       </w:tr>
       <w:tr>
+        <w:trPr>
+          <w:cantSplit/>
+        </w:trPr>
         <w:tc>
           <w:tcPr>
             <w:tcW w:w="929" w:type="dxa"/>
@@ -6968,6 +7222,9 @@
         </w:tc>
       </w:tr>
       <w:tr>
+        <w:trPr>
+          <w:cantSplit/>
+        </w:trPr>
         <w:tc>
           <w:tcPr>
             <w:tcW w:w="929" w:type="dxa"/>
@@ -7038,6 +7295,9 @@
         </w:tc>
       </w:tr>
       <w:tr>
+        <w:trPr>
+          <w:cantSplit/>
+        </w:trPr>
         <w:tc>
           <w:tcPr>
             <w:tcW w:w="929" w:type="dxa"/>
@@ -7108,6 +7368,9 @@
         </w:tc>
       </w:tr>
       <w:tr>
+        <w:trPr>
+          <w:cantSplit/>
+        </w:trPr>
         <w:tc>
           <w:tcPr>
             <w:tcW w:w="929" w:type="dxa"/>
@@ -7178,6 +7441,9 @@
         </w:tc>
       </w:tr>
       <w:tr>
+        <w:trPr>
+          <w:cantSplit/>
+        </w:trPr>
         <w:tc>
           <w:tcPr>
             <w:tcW w:w="929" w:type="dxa"/>
@@ -7248,6 +7514,9 @@
         </w:tc>
       </w:tr>
       <w:tr>
+        <w:trPr>
+          <w:cantSplit/>
+        </w:trPr>
         <w:tc>
           <w:tcPr>
             <w:tcW w:w="929" w:type="dxa"/>
@@ -7351,6 +7620,7 @@
       <w:tr>
         <w:trPr>
           <w:tblHeader w:val="true"/>
+          <w:cantSplit/>
         </w:trPr>
         <w:tc>
           <w:tcPr>
@@ -7411,6 +7681,9 @@
         </w:tc>
       </w:tr>
       <w:tr>
+        <w:trPr>
+          <w:cantSplit/>
+        </w:trPr>
         <w:tc>
           <w:tcPr>
             <w:tcW w:w="2101" w:type="dxa"/>
@@ -7464,6 +7737,9 @@
         </w:tc>
       </w:tr>
       <w:tr>
+        <w:trPr>
+          <w:cantSplit/>
+        </w:trPr>
         <w:tc>
           <w:tcPr>
             <w:tcW w:w="2101" w:type="dxa"/>
@@ -7517,6 +7793,9 @@
         </w:tc>
       </w:tr>
       <w:tr>
+        <w:trPr>
+          <w:cantSplit/>
+        </w:trPr>
         <w:tc>
           <w:tcPr>
             <w:tcW w:w="2101" w:type="dxa"/>
@@ -7570,6 +7849,9 @@
         </w:tc>
       </w:tr>
       <w:tr>
+        <w:trPr>
+          <w:cantSplit/>
+        </w:trPr>
         <w:tc>
           <w:tcPr>
             <w:tcW w:w="2101" w:type="dxa"/>
@@ -7623,6 +7905,9 @@
         </w:tc>
       </w:tr>
       <w:tr>
+        <w:trPr>
+          <w:cantSplit/>
+        </w:trPr>
         <w:tc>
           <w:tcPr>
             <w:tcW w:w="2101" w:type="dxa"/>
@@ -7676,6 +7961,9 @@
         </w:tc>
       </w:tr>
       <w:tr>
+        <w:trPr>
+          <w:cantSplit/>
+        </w:trPr>
         <w:tc>
           <w:tcPr>
             <w:tcW w:w="2101" w:type="dxa"/>
@@ -7729,6 +8017,9 @@
         </w:tc>
       </w:tr>
       <w:tr>
+        <w:trPr>
+          <w:cantSplit/>
+        </w:trPr>
         <w:tc>
           <w:tcPr>
             <w:tcW w:w="2101" w:type="dxa"/>
@@ -7782,6 +8073,9 @@
         </w:tc>
       </w:tr>
       <w:tr>
+        <w:trPr>
+          <w:cantSplit/>
+        </w:trPr>
         <w:tc>
           <w:tcPr>
             <w:tcW w:w="2101" w:type="dxa"/>
@@ -7835,6 +8129,9 @@
         </w:tc>
       </w:tr>
       <w:tr>
+        <w:trPr>
+          <w:cantSplit/>
+        </w:trPr>
         <w:tc>
           <w:tcPr>
             <w:tcW w:w="2101" w:type="dxa"/>
@@ -7888,6 +8185,9 @@
         </w:tc>
       </w:tr>
       <w:tr>
+        <w:trPr>
+          <w:cantSplit/>
+        </w:trPr>
         <w:tc>
           <w:tcPr>
             <w:tcW w:w="2101" w:type="dxa"/>
@@ -7941,6 +8241,9 @@
         </w:tc>
       </w:tr>
       <w:tr>
+        <w:trPr>
+          <w:cantSplit/>
+        </w:trPr>
         <w:tc>
           <w:tcPr>
             <w:tcW w:w="2101" w:type="dxa"/>
@@ -7994,6 +8297,9 @@
         </w:tc>
       </w:tr>
       <w:tr>
+        <w:trPr>
+          <w:cantSplit/>
+        </w:trPr>
         <w:tc>
           <w:tcPr>
             <w:tcW w:w="2101" w:type="dxa"/>
@@ -8068,7 +8374,7 @@
         <w:rPr>
           <w:sz w:val="22"/>
         </w:rPr>
-        <w:t xml:space="preserve">El código tiene decisiones tomadas después de los documentos de diseño. Esta tabla las lista para actualizar los documentos o decidir si el código debe volver a lo documentado.</w:t>
+        <w:t xml:space="preserve">El código tiene decisiones tomadas después de los documentos de diseño. La tabla las lista y dice cómo quedó cada una en los documentos del 26 de octubre.</w:t>
       </w:r>
     </w:p>
     <w:tbl>
@@ -8087,18 +8393,19 @@
         </w:tblBorders>
       </w:tblPr>
       <w:tblGrid>
-        <w:gridCol w:w="1415"/>
-        <w:gridCol w:w="1955"/>
-        <w:gridCol w:w="2369"/>
-        <w:gridCol w:w="2180"/>
+        <w:gridCol w:w="1380"/>
+        <w:gridCol w:w="1784"/>
+        <w:gridCol w:w="2310"/>
+        <w:gridCol w:w="2444"/>
       </w:tblGrid>
       <w:tr>
         <w:trPr>
           <w:tblHeader w:val="true"/>
-        </w:trPr>
-        <w:tc>
-          <w:tcPr>
-            <w:tcW w:w="1415" w:type="dxa"/>
+          <w:cantSplit/>
+        </w:trPr>
+        <w:tc>
+          <w:tcPr>
+            <w:tcW w:w="1380" w:type="dxa"/>
             <w:shd w:val="clear" w:color="auto" w:fill="D9E2F3"/>
           </w:tcPr>
           <w:p>
@@ -8117,7 +8424,7 @@
         </w:tc>
         <w:tc>
           <w:tcPr>
-            <w:tcW w:w="1955" w:type="dxa"/>
+            <w:tcW w:w="1784" w:type="dxa"/>
             <w:shd w:val="clear" w:color="auto" w:fill="D9E2F3"/>
           </w:tcPr>
           <w:p>
@@ -8130,13 +8437,13 @@
                 <w:b/>
                 <w:sz w:val="18"/>
               </w:rPr>
-              <w:t xml:space="preserve">Lo que dicen los documentos</w:t>
-            </w:r>
-          </w:p>
-        </w:tc>
-        <w:tc>
-          <w:tcPr>
-            <w:tcW w:w="2369" w:type="dxa"/>
+              <w:t xml:space="preserve">Lo que decían los documentos</w:t>
+            </w:r>
+          </w:p>
+        </w:tc>
+        <w:tc>
+          <w:tcPr>
+            <w:tcW w:w="2310" w:type="dxa"/>
             <w:shd w:val="clear" w:color="auto" w:fill="D9E2F3"/>
           </w:tcPr>
           <w:p>
@@ -8155,7 +8462,7 @@
         </w:tc>
         <w:tc>
           <w:tcPr>
-            <w:tcW w:w="2180" w:type="dxa"/>
+            <w:tcW w:w="2444" w:type="dxa"/>
             <w:shd w:val="clear" w:color="auto" w:fill="D9E2F3"/>
           </w:tcPr>
           <w:p>
@@ -8168,15 +8475,18 @@
                 <w:b/>
                 <w:sz w:val="18"/>
               </w:rPr>
-              <w:t xml:space="preserve">Acción propuesta</w:t>
-            </w:r>
-          </w:p>
-        </w:tc>
-      </w:tr>
-      <w:tr>
-        <w:tc>
-          <w:tcPr>
-            <w:tcW w:w="1415" w:type="dxa"/>
+              <w:t xml:space="preserve">Estado en los documentos</w:t>
+            </w:r>
+          </w:p>
+        </w:tc>
+      </w:tr>
+      <w:tr>
+        <w:trPr>
+          <w:cantSplit/>
+        </w:trPr>
+        <w:tc>
+          <w:tcPr>
+            <w:tcW w:w="1380" w:type="dxa"/>
           </w:tcPr>
           <w:p>
             <w:pPr>
@@ -8193,24 +8503,24 @@
         </w:tc>
         <w:tc>
           <w:tcPr>
-            <w:tcW w:w="1955" w:type="dxa"/>
-          </w:tcPr>
-          <w:p>
-            <w:pPr>
-              <w:pStyle w:val="Compact"/>
-              <w:jc w:val="left"/>
-            </w:pPr>
-            <w:r>
-              <w:rPr>
-                <w:sz w:val="18"/>
-              </w:rPr>
-              <w:t xml:space="preserve">Lector biométrico HID (SICMA-REQ, SICMA-CUS)</w:t>
-            </w:r>
-          </w:p>
-        </w:tc>
-        <w:tc>
-          <w:tcPr>
-            <w:tcW w:w="2369" w:type="dxa"/>
+            <w:tcW w:w="1784" w:type="dxa"/>
+          </w:tcPr>
+          <w:p>
+            <w:pPr>
+              <w:pStyle w:val="Compact"/>
+              <w:jc w:val="left"/>
+            </w:pPr>
+            <w:r>
+              <w:rPr>
+                <w:sz w:val="18"/>
+              </w:rPr>
+              <w:t xml:space="preserve">Lector biométrico HID</w:t>
+            </w:r>
+          </w:p>
+        </w:tc>
+        <w:tc>
+          <w:tcPr>
+            <w:tcW w:w="2310" w:type="dxa"/>
           </w:tcPr>
           <w:p>
             <w:pPr>
@@ -8227,26 +8537,29 @@
         </w:tc>
         <w:tc>
           <w:tcPr>
-            <w:tcW w:w="2180" w:type="dxa"/>
-          </w:tcPr>
-          <w:p>
-            <w:pPr>
-              <w:pStyle w:val="Compact"/>
-              <w:jc w:val="left"/>
-            </w:pPr>
-            <w:r>
-              <w:rPr>
-                <w:sz w:val="18"/>
-              </w:rPr>
-              <w:t xml:space="preserve">Actualizar los documentos y cerrar D-03 de SICMA-REQ</w:t>
-            </w:r>
-          </w:p>
-        </w:tc>
-      </w:tr>
-      <w:tr>
-        <w:tc>
-          <w:tcPr>
-            <w:tcW w:w="1415" w:type="dxa"/>
+            <w:tcW w:w="2444" w:type="dxa"/>
+          </w:tcPr>
+          <w:p>
+            <w:pPr>
+              <w:pStyle w:val="Compact"/>
+              <w:jc w:val="left"/>
+            </w:pPr>
+            <w:r>
+              <w:rPr>
+                <w:sz w:val="18"/>
+              </w:rPr>
+              <w:t xml:space="preserve">Actualizado en SICMA-REQ, SICMA-CUS, SICMA-ACT, SICMA-CLA y los demás; D-03 de SICMA-REQ cerrado</w:t>
+            </w:r>
+          </w:p>
+        </w:tc>
+      </w:tr>
+      <w:tr>
+        <w:trPr>
+          <w:cantSplit/>
+        </w:trPr>
+        <w:tc>
+          <w:tcPr>
+            <w:tcW w:w="1380" w:type="dxa"/>
           </w:tcPr>
           <w:p>
             <w:pPr>
@@ -8263,7 +8576,7 @@
         </w:tc>
         <w:tc>
           <w:tcPr>
-            <w:tcW w:w="1955" w:type="dxa"/>
+            <w:tcW w:w="1784" w:type="dxa"/>
           </w:tcPr>
           <w:p>
             <w:pPr>
@@ -8280,7 +8593,7 @@
         </w:tc>
         <w:tc>
           <w:tcPr>
-            <w:tcW w:w="2369" w:type="dxa"/>
+            <w:tcW w:w="2310" w:type="dxa"/>
           </w:tcPr>
           <w:p>
             <w:pPr>
@@ -8297,26 +8610,29 @@
         </w:tc>
         <w:tc>
           <w:tcPr>
-            <w:tcW w:w="2180" w:type="dxa"/>
-          </w:tcPr>
-          <w:p>
-            <w:pPr>
-              <w:pStyle w:val="Compact"/>
-              <w:jc w:val="left"/>
-            </w:pPr>
-            <w:r>
-              <w:rPr>
-                <w:sz w:val="18"/>
-              </w:rPr>
-              <w:t xml:space="preserve">Actualizar RF-ID-05 y la matriz de permisos (D-13 de SICMA-REQ)</w:t>
-            </w:r>
-          </w:p>
-        </w:tc>
-      </w:tr>
-      <w:tr>
-        <w:tc>
-          <w:tcPr>
-            <w:tcW w:w="1415" w:type="dxa"/>
+            <w:tcW w:w="2444" w:type="dxa"/>
+          </w:tcPr>
+          <w:p>
+            <w:pPr>
+              <w:pStyle w:val="Compact"/>
+              <w:jc w:val="left"/>
+            </w:pPr>
+            <w:r>
+              <w:rPr>
+                <w:sz w:val="18"/>
+              </w:rPr>
+              <w:t xml:space="preserve">RF-ID-05 y una nota bajo la matriz en SICMA-REQ; las columnas de la matriz siguen pendientes (D-13)</w:t>
+            </w:r>
+          </w:p>
+        </w:tc>
+      </w:tr>
+      <w:tr>
+        <w:trPr>
+          <w:cantSplit/>
+        </w:trPr>
+        <w:tc>
+          <w:tcPr>
+            <w:tcW w:w="1380" w:type="dxa"/>
           </w:tcPr>
           <w:p>
             <w:pPr>
@@ -8333,24 +8649,24 @@
         </w:tc>
         <w:tc>
           <w:tcPr>
-            <w:tcW w:w="1955" w:type="dxa"/>
-          </w:tcPr>
-          <w:p>
-            <w:pPr>
-              <w:pStyle w:val="Compact"/>
-              <w:jc w:val="left"/>
-            </w:pPr>
-            <w:r>
-              <w:rPr>
-                <w:sz w:val="18"/>
-              </w:rPr>
-              <w:t xml:space="preserve">La API recibe llamadas del flujo (D-02 de SICMA-REQ)</w:t>
-            </w:r>
-          </w:p>
-        </w:tc>
-        <w:tc>
-          <w:tcPr>
-            <w:tcW w:w="2369" w:type="dxa"/>
+            <w:tcW w:w="1784" w:type="dxa"/>
+          </w:tcPr>
+          <w:p>
+            <w:pPr>
+              <w:pStyle w:val="Compact"/>
+              <w:jc w:val="left"/>
+            </w:pPr>
+            <w:r>
+              <w:rPr>
+                <w:sz w:val="18"/>
+              </w:rPr>
+              <w:t xml:space="preserve">La API recibe llamadas del flujo</w:t>
+            </w:r>
+          </w:p>
+        </w:tc>
+        <w:tc>
+          <w:tcPr>
+            <w:tcW w:w="2310" w:type="dxa"/>
           </w:tcPr>
           <w:p>
             <w:pPr>
@@ -8367,26 +8683,29 @@
         </w:tc>
         <w:tc>
           <w:tcPr>
-            <w:tcW w:w="2180" w:type="dxa"/>
-          </w:tcPr>
-          <w:p>
-            <w:pPr>
-              <w:pStyle w:val="Compact"/>
-              <w:jc w:val="left"/>
-            </w:pPr>
-            <w:r>
-              <w:rPr>
-                <w:sz w:val="18"/>
-              </w:rPr>
-              <w:t xml:space="preserve">Cerrar D-02 con esta decisión</w:t>
-            </w:r>
-          </w:p>
-        </w:tc>
-      </w:tr>
-      <w:tr>
-        <w:tc>
-          <w:tcPr>
-            <w:tcW w:w="1415" w:type="dxa"/>
+            <w:tcW w:w="2444" w:type="dxa"/>
+          </w:tcPr>
+          <w:p>
+            <w:pPr>
+              <w:pStyle w:val="Compact"/>
+              <w:jc w:val="left"/>
+            </w:pPr>
+            <w:r>
+              <w:rPr>
+                <w:sz w:val="18"/>
+              </w:rPr>
+              <w:t xml:space="preserve">D-02 cerrado en SICMA-REQ, SICMA-CUS, SICMA-ACT y SICMA-CLA</w:t>
+            </w:r>
+          </w:p>
+        </w:tc>
+      </w:tr>
+      <w:tr>
+        <w:trPr>
+          <w:cantSplit/>
+        </w:trPr>
+        <w:tc>
+          <w:tcPr>
+            <w:tcW w:w="1380" w:type="dxa"/>
           </w:tcPr>
           <w:p>
             <w:pPr>
@@ -8403,7 +8722,7 @@
         </w:tc>
         <w:tc>
           <w:tcPr>
-            <w:tcW w:w="1955" w:type="dxa"/>
+            <w:tcW w:w="1784" w:type="dxa"/>
           </w:tcPr>
           <w:p>
             <w:pPr>
@@ -8420,7 +8739,7 @@
         </w:tc>
         <w:tc>
           <w:tcPr>
-            <w:tcW w:w="2369" w:type="dxa"/>
+            <w:tcW w:w="2310" w:type="dxa"/>
           </w:tcPr>
           <w:p>
             <w:pPr>
@@ -8437,26 +8756,29 @@
         </w:tc>
         <w:tc>
           <w:tcPr>
-            <w:tcW w:w="2180" w:type="dxa"/>
-          </w:tcPr>
-          <w:p>
-            <w:pPr>
-              <w:pStyle w:val="Compact"/>
-              <w:jc w:val="left"/>
-            </w:pPr>
-            <w:r>
-              <w:rPr>
-                <w:sz w:val="18"/>
-              </w:rPr>
-              <w:t xml:space="preserve">Actualizar SICMA-REQ y SICMA-ACT</w:t>
-            </w:r>
-          </w:p>
-        </w:tc>
-      </w:tr>
-      <w:tr>
-        <w:tc>
-          <w:tcPr>
-            <w:tcW w:w="1415" w:type="dxa"/>
+            <w:tcW w:w="2444" w:type="dxa"/>
+          </w:tcPr>
+          <w:p>
+            <w:pPr>
+              <w:pStyle w:val="Compact"/>
+              <w:jc w:val="left"/>
+            </w:pPr>
+            <w:r>
+              <w:rPr>
+                <w:sz w:val="18"/>
+              </w:rPr>
+              <w:t xml:space="preserve">RN-12 en SICMA-REQ y casos de uso actualizados; el diagrama AD-09 de SICMA-ACT aún dice Asignada y Cerrada</w:t>
+            </w:r>
+          </w:p>
+        </w:tc>
+      </w:tr>
+      <w:tr>
+        <w:trPr>
+          <w:cantSplit/>
+        </w:trPr>
+        <w:tc>
+          <w:tcPr>
+            <w:tcW w:w="1380" w:type="dxa"/>
           </w:tcPr>
           <w:p>
             <w:pPr>
@@ -8473,7 +8795,7 @@
         </w:tc>
         <w:tc>
           <w:tcPr>
-            <w:tcW w:w="1955" w:type="dxa"/>
+            <w:tcW w:w="1784" w:type="dxa"/>
           </w:tcPr>
           <w:p>
             <w:pPr>
@@ -8490,7 +8812,7 @@
         </w:tc>
         <w:tc>
           <w:tcPr>
-            <w:tcW w:w="2369" w:type="dxa"/>
+            <w:tcW w:w="2310" w:type="dxa"/>
           </w:tcPr>
           <w:p>
             <w:pPr>
@@ -8507,26 +8829,29 @@
         </w:tc>
         <w:tc>
           <w:tcPr>
-            <w:tcW w:w="2180" w:type="dxa"/>
-          </w:tcPr>
-          <w:p>
-            <w:pPr>
-              <w:pStyle w:val="Compact"/>
-              <w:jc w:val="left"/>
-            </w:pPr>
-            <w:r>
-              <w:rPr>
-                <w:sz w:val="18"/>
-              </w:rPr>
-              <w:t xml:space="preserve">Agregar requerimientos y revisar SICMA-ESO por el tratamiento de datos</w:t>
-            </w:r>
-          </w:p>
-        </w:tc>
-      </w:tr>
-      <w:tr>
-        <w:tc>
-          <w:tcPr>
-            <w:tcW w:w="1415" w:type="dxa"/>
+            <w:tcW w:w="2444" w:type="dxa"/>
+          </w:tcPr>
+          <w:p>
+            <w:pPr>
+              <w:pStyle w:val="Compact"/>
+              <w:jc w:val="left"/>
+            </w:pPr>
+            <w:r>
+              <w:rPr>
+                <w:sz w:val="18"/>
+              </w:rPr>
+              <w:t xml:space="preserve">Descrito en SICMA-CUS, SICMA-ACT y SICMA-ESO; falta decidir si se crean requerimientos propios</w:t>
+            </w:r>
+          </w:p>
+        </w:tc>
+      </w:tr>
+      <w:tr>
+        <w:trPr>
+          <w:cantSplit/>
+        </w:trPr>
+        <w:tc>
+          <w:tcPr>
+            <w:tcW w:w="1380" w:type="dxa"/>
           </w:tcPr>
           <w:p>
             <w:pPr>
@@ -8543,7 +8868,7 @@
         </w:tc>
         <w:tc>
           <w:tcPr>
-            <w:tcW w:w="1955" w:type="dxa"/>
+            <w:tcW w:w="1784" w:type="dxa"/>
           </w:tcPr>
           <w:p>
             <w:pPr>
@@ -8560,7 +8885,7 @@
         </w:tc>
         <w:tc>
           <w:tcPr>
-            <w:tcW w:w="2369" w:type="dxa"/>
+            <w:tcW w:w="2310" w:type="dxa"/>
           </w:tcPr>
           <w:p>
             <w:pPr>
@@ -8577,26 +8902,29 @@
         </w:tc>
         <w:tc>
           <w:tcPr>
-            <w:tcW w:w="2180" w:type="dxa"/>
-          </w:tcPr>
-          <w:p>
-            <w:pPr>
-              <w:pStyle w:val="Compact"/>
-              <w:jc w:val="left"/>
-            </w:pPr>
-            <w:r>
-              <w:rPr>
-                <w:sz w:val="18"/>
-              </w:rPr>
-              <w:t xml:space="preserve">Agregar requerimiento</w:t>
-            </w:r>
-          </w:p>
-        </w:tc>
-      </w:tr>
-      <w:tr>
-        <w:tc>
-          <w:tcPr>
-            <w:tcW w:w="1415" w:type="dxa"/>
+            <w:tcW w:w="2444" w:type="dxa"/>
+          </w:tcPr>
+          <w:p>
+            <w:pPr>
+              <w:pStyle w:val="Compact"/>
+              <w:jc w:val="left"/>
+            </w:pPr>
+            <w:r>
+              <w:rPr>
+                <w:sz w:val="18"/>
+              </w:rPr>
+              <w:t xml:space="preserve">Descrito en CU-13 de SICMA-CUS; falta un requerimiento propio</w:t>
+            </w:r>
+          </w:p>
+        </w:tc>
+      </w:tr>
+      <w:tr>
+        <w:trPr>
+          <w:cantSplit/>
+        </w:trPr>
+        <w:tc>
+          <w:tcPr>
+            <w:tcW w:w="1380" w:type="dxa"/>
           </w:tcPr>
           <w:p>
             <w:pPr>
@@ -8613,7 +8941,7 @@
         </w:tc>
         <w:tc>
           <w:tcPr>
-            <w:tcW w:w="1955" w:type="dxa"/>
+            <w:tcW w:w="1784" w:type="dxa"/>
           </w:tcPr>
           <w:p>
             <w:pPr>
@@ -8630,7 +8958,7 @@
         </w:tc>
         <w:tc>
           <w:tcPr>
-            <w:tcW w:w="2369" w:type="dxa"/>
+            <w:tcW w:w="2310" w:type="dxa"/>
           </w:tcPr>
           <w:p>
             <w:pPr>
@@ -8647,26 +8975,29 @@
         </w:tc>
         <w:tc>
           <w:tcPr>
-            <w:tcW w:w="2180" w:type="dxa"/>
-          </w:tcPr>
-          <w:p>
-            <w:pPr>
-              <w:pStyle w:val="Compact"/>
-              <w:jc w:val="left"/>
-            </w:pPr>
-            <w:r>
-              <w:rPr>
-                <w:sz w:val="18"/>
-              </w:rPr>
-              <w:t xml:space="preserve">Agregar a la matriz de permisos</w:t>
-            </w:r>
-          </w:p>
-        </w:tc>
-      </w:tr>
-      <w:tr>
-        <w:tc>
-          <w:tcPr>
-            <w:tcW w:w="1415" w:type="dxa"/>
+            <w:tcW w:w="2444" w:type="dxa"/>
+          </w:tcPr>
+          <w:p>
+            <w:pPr>
+              <w:pStyle w:val="Compact"/>
+              <w:jc w:val="left"/>
+            </w:pPr>
+            <w:r>
+              <w:rPr>
+                <w:sz w:val="18"/>
+              </w:rPr>
+              <w:t xml:space="preserve">RN-13 en SICMA-REQ y CU-04 de SICMA-CUS</w:t>
+            </w:r>
+          </w:p>
+        </w:tc>
+      </w:tr>
+      <w:tr>
+        <w:trPr>
+          <w:cantSplit/>
+        </w:trPr>
+        <w:tc>
+          <w:tcPr>
+            <w:tcW w:w="1380" w:type="dxa"/>
           </w:tcPr>
           <w:p>
             <w:pPr>
@@ -8683,7 +9014,7 @@
         </w:tc>
         <w:tc>
           <w:tcPr>
-            <w:tcW w:w="1955" w:type="dxa"/>
+            <w:tcW w:w="1784" w:type="dxa"/>
           </w:tcPr>
           <w:p>
             <w:pPr>
@@ -8700,7 +9031,7 @@
         </w:tc>
         <w:tc>
           <w:tcPr>
-            <w:tcW w:w="2369" w:type="dxa"/>
+            <w:tcW w:w="2310" w:type="dxa"/>
           </w:tcPr>
           <w:p>
             <w:pPr>
@@ -8717,18 +9048,18 @@
         </w:tc>
         <w:tc>
           <w:tcPr>
-            <w:tcW w:w="2180" w:type="dxa"/>
-          </w:tcPr>
-          <w:p>
-            <w:pPr>
-              <w:pStyle w:val="Compact"/>
-              <w:jc w:val="left"/>
-            </w:pPr>
-            <w:r>
-              <w:rPr>
-                <w:sz w:val="18"/>
-              </w:rPr>
-              <w:t xml:space="preserve">Dejar claro en SICMA-REQ y SICMA-ESO que las plantillas quedan en el PC del lector</w:t>
+            <w:tcW w:w="2444" w:type="dxa"/>
+          </w:tcPr>
+          <w:p>
+            <w:pPr>
+              <w:pStyle w:val="Compact"/>
+              <w:jc w:val="left"/>
+            </w:pPr>
+            <w:r>
+              <w:rPr>
+                <w:sz w:val="18"/>
+              </w:rPr>
+              <w:t xml:space="preserve">RN-11 en SICMA-REQ y un riesgo nuevo en SICMA-ESO (D-05)</w:t>
             </w:r>
           </w:p>
         </w:tc>
@@ -8768,6 +9099,7 @@
       <w:tr>
         <w:trPr>
           <w:tblHeader w:val="true"/>
+          <w:cantSplit/>
         </w:trPr>
         <w:tc>
           <w:tcPr>
@@ -8847,6 +9179,9 @@
         </w:tc>
       </w:tr>
       <w:tr>
+        <w:trPr>
+          <w:cantSplit/>
+        </w:trPr>
         <w:tc>
           <w:tcPr>
             <w:tcW w:w="1157" w:type="dxa"/>
@@ -8917,6 +9252,9 @@
         </w:tc>
       </w:tr>
       <w:tr>
+        <w:trPr>
+          <w:cantSplit/>
+        </w:trPr>
         <w:tc>
           <w:tcPr>
             <w:tcW w:w="1157" w:type="dxa"/>
@@ -8987,6 +9325,9 @@
         </w:tc>
       </w:tr>
       <w:tr>
+        <w:trPr>
+          <w:cantSplit/>
+        </w:trPr>
         <w:tc>
           <w:tcPr>
             <w:tcW w:w="1157" w:type="dxa"/>
@@ -9057,6 +9398,9 @@
         </w:tc>
       </w:tr>
       <w:tr>
+        <w:trPr>
+          <w:cantSplit/>
+        </w:trPr>
         <w:tc>
           <w:tcPr>
             <w:tcW w:w="1157" w:type="dxa"/>
@@ -9127,6 +9471,9 @@
         </w:tc>
       </w:tr>
       <w:tr>
+        <w:trPr>
+          <w:cantSplit/>
+        </w:trPr>
         <w:tc>
           <w:tcPr>
             <w:tcW w:w="1157" w:type="dxa"/>
@@ -9197,6 +9544,9 @@
         </w:tc>
       </w:tr>
       <w:tr>
+        <w:trPr>
+          <w:cantSplit/>
+        </w:trPr>
         <w:tc>
           <w:tcPr>
             <w:tcW w:w="1157" w:type="dxa"/>
@@ -9227,7 +9577,7 @@
               <w:rPr>
                 <w:sz w:val="18"/>
               </w:rPr>
-              <w:t xml:space="preserve">Actualizar documentos</w:t>
+              <w:t xml:space="preserve">Documentos pendientes</w:t>
             </w:r>
           </w:p>
         </w:tc>
@@ -9244,7 +9594,7 @@
               <w:rPr>
                 <w:sz w:val="18"/>
               </w:rPr>
-              <w:t xml:space="preserve">Aplicar las diferencias de la última tabla a SICMA-REQ, SICMA-CUS, SICMA-ACT y SICMA-ESO</w:t>
+              <w:t xml:space="preserve">Decidir si el personal externo y la gestión de alertas llevan requerimientos propios (cambia los conteos de SICMA-REQ y SICMA-CPR) y redibujar el diagrama AD-09 de SICMA-ACT</w:t>
             </w:r>
           </w:p>
         </w:tc>
@@ -9267,6 +9617,9 @@
         </w:tc>
       </w:tr>
       <w:tr>
+        <w:trPr>
+          <w:cantSplit/>
+        </w:trPr>
         <w:tc>
           <w:tcPr>
             <w:tcW w:w="1157" w:type="dxa"/>
@@ -9337,6 +9690,9 @@
         </w:tc>
       </w:tr>
       <w:tr>
+        <w:trPr>
+          <w:cantSplit/>
+        </w:trPr>
         <w:tc>
           <w:tcPr>
             <w:tcW w:w="1157" w:type="dxa"/>
@@ -9439,6 +9795,7 @@
       <w:tr>
         <w:trPr>
           <w:tblHeader w:val="true"/>
+          <w:cantSplit/>
         </w:trPr>
         <w:tc>
           <w:tcPr>
@@ -9480,6 +9837,9 @@
         </w:tc>
       </w:tr>
       <w:tr>
+        <w:trPr>
+          <w:cantSplit/>
+        </w:trPr>
         <w:tc>
           <w:tcPr>
             <w:tcW w:w="2259" w:type="dxa"/>
@@ -9516,6 +9876,9 @@
         </w:tc>
       </w:tr>
       <w:tr>
+        <w:trPr>
+          <w:cantSplit/>
+        </w:trPr>
         <w:tc>
           <w:tcPr>
             <w:tcW w:w="2259" w:type="dxa"/>
@@ -9552,6 +9915,9 @@
         </w:tc>
       </w:tr>
       <w:tr>
+        <w:trPr>
+          <w:cantSplit/>
+        </w:trPr>
         <w:tc>
           <w:tcPr>
             <w:tcW w:w="2259" w:type="dxa"/>
@@ -9588,6 +9954,9 @@
         </w:tc>
       </w:tr>
       <w:tr>
+        <w:trPr>
+          <w:cantSplit/>
+        </w:trPr>
         <w:tc>
           <w:tcPr>
             <w:tcW w:w="2259" w:type="dxa"/>
@@ -9624,6 +9993,9 @@
         </w:tc>
       </w:tr>
       <w:tr>
+        <w:trPr>
+          <w:cantSplit/>
+        </w:trPr>
         <w:tc>
           <w:tcPr>
             <w:tcW w:w="2259" w:type="dxa"/>
@@ -9660,6 +10032,9 @@
         </w:tc>
       </w:tr>
       <w:tr>
+        <w:trPr>
+          <w:cantSplit/>
+        </w:trPr>
         <w:tc>
           <w:tcPr>
             <w:tcW w:w="2259" w:type="dxa"/>
@@ -9696,6 +10071,9 @@
         </w:tc>
       </w:tr>
       <w:tr>
+        <w:trPr>
+          <w:cantSplit/>
+        </w:trPr>
         <w:tc>
           <w:tcPr>
             <w:tcW w:w="2259" w:type="dxa"/>
@@ -9732,6 +10110,9 @@
         </w:tc>
       </w:tr>
       <w:tr>
+        <w:trPr>
+          <w:cantSplit/>
+        </w:trPr>
         <w:tc>
           <w:tcPr>
             <w:tcW w:w="2259" w:type="dxa"/>
@@ -9768,6 +10149,9 @@
         </w:tc>
       </w:tr>
       <w:tr>
+        <w:trPr>
+          <w:cantSplit/>
+        </w:trPr>
         <w:tc>
           <w:tcPr>
             <w:tcW w:w="2259" w:type="dxa"/>
@@ -9804,6 +10188,9 @@
         </w:tc>
       </w:tr>
       <w:tr>
+        <w:trPr>
+          <w:cantSplit/>
+        </w:trPr>
         <w:tc>
           <w:tcPr>
             <w:tcW w:w="2259" w:type="dxa"/>
@@ -9888,7 +10275,7 @@
         <w:rPr>
           <w:b w:val="0"/>
         </w:rPr>
-        <w:t>[2] SICMA-REQ v1.0. Requerimientos. Equipo SICMA, 2026-10-17.</w:t>
+        <w:t>[2] SICMA-REQ v1.1. Requerimientos. Equipo SICMA, 2026-10-26.</w:t>
       </w:r>
     </w:p>
     <w:p>
@@ -9901,7 +10288,7 @@
         <w:rPr>
           <w:b w:val="0"/>
         </w:rPr>
-        <w:t>[3] SICMA-CUS v1.0. Casos de Uso. Equipo SICMA, 2026-10-17.</w:t>
+        <w:t>[3] SICMA-CUS v1.1. Casos de Uso. Equipo SICMA, 2026-10-26.</w:t>
       </w:r>
     </w:p>
     <w:p>
@@ -9914,7 +10301,7 @@
         <w:rPr>
           <w:b w:val="0"/>
         </w:rPr>
-        <w:t>[4] SICMA-CLA v1.0. Diagrama de Clases. Equipo SICMA, 2026-10-17.</w:t>
+        <w:t>[4] SICMA-CLA v1.1. Diagrama de Clases. Equipo SICMA, 2026-10-26.</w:t>
       </w:r>
     </w:p>
     <w:p>
@@ -9927,7 +10314,7 @@
         <w:rPr>
           <w:b w:val="0"/>
         </w:rPr>
-        <w:t>[5] SICMA-ACT v1.0. Diagramas de Actividad. Equipo SICMA, 2026-10-17.</w:t>
+        <w:t>[5] SICMA-ACT v1.1. Diagramas de Actividad. Equipo SICMA, 2026-10-26.</w:t>
       </w:r>
     </w:p>
     <w:p>
@@ -9940,7 +10327,7 @@
         <w:rPr>
           <w:b w:val="0"/>
         </w:rPr>
-        <w:t>[6] SICMA-BDD v1.0. Modelo de Base de Datos. Equipo SICMA, 2026-10-17.</w:t>
+        <w:t>[6] SICMA-BDD v1.1. Modelo de Base de Datos. Equipo SICMA, 2026-10-26.</w:t>
       </w:r>
     </w:p>
     <w:p>
@@ -9953,7 +10340,7 @@
         <w:rPr>
           <w:b w:val="0"/>
         </w:rPr>
-        <w:t>[7] SICMA-PRY v1.1. Plan del Proyecto. Equipo SICMA, 2026-10-24.</w:t>
+        <w:t>[7] SICMA-CPR v1.1. Casos de Prueba. Equipo SICMA, 2026-10-26.</w:t>
       </w:r>
     </w:p>
     <w:p>
@@ -9966,7 +10353,20 @@
         <w:rPr>
           <w:b w:val="0"/>
         </w:rPr>
-        <w:t>[8] SICMA-ESO v1.0. Impacto Ético, Social y Sostenibilidad. Equipo SICMA, 2026-10-24.</w:t>
+        <w:t>[8] SICMA-PRY v1.2. Plan del Proyecto. Equipo SICMA, 2026-10-26.</w:t>
+      </w:r>
+    </w:p>
+    <w:p>
+      <w:pPr>
+        <w:pStyle w:val="Compact"/>
+        <w:spacing w:after="60"/>
+        <w:ind w:left="510" w:hanging="510"/>
+      </w:pPr>
+      <w:r>
+        <w:rPr>
+          <w:b w:val="0"/>
+        </w:rPr>
+        <w:t>[9] SICMA-ESO v1.1. Impacto Ético, Social y Sostenibilidad. Equipo SICMA, 2026-10-26.</w:t>
       </w:r>
     </w:p>
     <w:p>
@@ -9995,7 +10395,7 @@
         <w:rPr>
           <w:b w:val="0"/>
         </w:rPr>
-        <w:t>[9] Kruchten, P. (1995). Architectural Blueprints, the "4+1" View Model of Software Architecture. IEEE Software, 12(6), 42-50. https://en.wikipedia.org/wiki/4%2B1_architectural_view_model</w:t>
+        <w:t>[10] Kruchten, P. (1995). Architectural Blueprints, the "4+1" View Model of Software Architecture. IEEE Software, 12(6), 42-50. https://doi.org/10.1109/52.469759</w:t>
       </w:r>
     </w:p>
     <w:p>
@@ -10008,7 +10408,7 @@
         <w:rPr>
           <w:b w:val="0"/>
         </w:rPr>
-        <w:t>[10] Cloudflare. Cloudflare Tunnel. https://developers.cloudflare.com/tunnel/</w:t>
+        <w:t>[11] Cloudflare. Cloudflare Tunnel. https://developers.cloudflare.com/tunnel/</w:t>
       </w:r>
     </w:p>
     <w:p>
@@ -10021,7 +10421,7 @@
         <w:rPr>
           <w:b w:val="0"/>
         </w:rPr>
-        <w:t>[11] Oracle. MySQL Reference Manual, Group Replication y InnoDB Cluster (Getting Started). https://dev.mysql.com/doc/en/group-replication-getting-started.html</w:t>
+        <w:t>[12] Oracle. MySQL Reference Manual, Group Replication y InnoDB Cluster (Getting Started). https://dev.mysql.com/doc/en/group-replication-getting-started.html</w:t>
       </w:r>
     </w:p>
     <w:p>
@@ -10034,7 +10434,7 @@
         <w:rPr>
           <w:b w:val="0"/>
         </w:rPr>
-        <w:t>[12] OWASP Foundation. (2021). OWASP Top 10:2021. https://owasp.org/Top10/</w:t>
+        <w:t>[13] OWASP Foundation. (2021). OWASP Top 10:2021. https://owasp.org/Top10/</w:t>
       </w:r>
     </w:p>
     <w:bookmarkEnd w:id="60"/>

</xml_diff>